<commit_message>
Publish SmartStock project documentation
</commit_message>
<xml_diff>
--- a/docs/API_Documentation.docx
+++ b/docs/API_Documentation.docx
@@ -14,7 +14,7 @@
           <w:color w:val="B86147"/>
           <w:sz w:val="18"/>
         </w:rPr>
-        <w:t>CAPSTONE BACKEND DELIVERABLE</w:t>
+        <w:t>BACKEND API REFERENCE</w:t>
       </w:r>
     </w:p>
     <w:p>
@@ -263,7 +263,7 @@
           <w:color w:val="0B2545"/>
           <w:sz w:val="20"/>
         </w:rPr>
-        <w:t xml:space="preserve">Implementation status: </w:t>
+        <w:t>Implementation status: 27 REST endpoints implemented, integrated with SQLite, and covered by 45 automated integration tests.</w:t>
       </w:r>
       <w:r>
         <w:rPr>
@@ -273,7 +273,6 @@
           <w:color w:val="2F6E55"/>
           <w:sz w:val="20"/>
         </w:rPr>
-        <w:t>19 APIs implemented, integrated with SQLite, and covered by 27 automated integration tests.</w:t>
       </w:r>
     </w:p>
     <w:p>
@@ -8846,8 +8845,9 @@
         <w:color w:val="64748B"/>
         <w:sz w:val="16"/>
       </w:rPr>
-      <w:t xml:space="preserve">SmartStock Capstone  |  Page </w:t>
+      <w:t xml:space="preserve">SmartStock  |  Page </w:t>
     </w:r>
+    <w:r/>
     <w:r>
       <w:fldChar w:fldCharType="begin"/>
       <w:instrText xml:space="preserve"> PAGE </w:instrText>

</xml_diff>